<commit_message>
Add Dijkstra algorithm example for NWT3 class
- Introduced a new document detailing the Dijkstra algorithm using a network topology.
- Structured the document with headings, tasks, and tables to present the algorithm's steps and results clearly.
- Included a template for consistent formatting, including author, class, and version information.
- Highlighted key points and provided a summary of the algorithm's outcomes.
</commit_message>
<xml_diff>
--- a/3 Klasse/bs/ue00/UE00_Linux_User_Mgmt/protokoll.docx
+++ b/3 Klasse/bs/ue00/UE00_Linux_User_Mgmt/protokoll.docx
@@ -10,9 +10,11 @@
         </w:tabs>
         <w:ind w:left="0" w:firstLine="0"/>
       </w:pPr>
+      <w:proofErr w:type="gramStart"/>
       <w:r>
         <w:t>A</w:t>
       </w:r>
+      <w:proofErr w:type="gramEnd"/>
       <w:r>
         <w:tab/>
         <w:t>Objective</w:t>
@@ -163,11 +165,19 @@
       <w:r>
         <w:t xml:space="preserve">→ Be sure to provide answers to all questions and to document </w:t>
       </w:r>
+      <w:proofErr w:type="gramStart"/>
       <w:r>
         <w:rPr>
           <w:b/>
         </w:rPr>
-        <w:t xml:space="preserve">each and every </w:t>
+        <w:t>each and every</w:t>
+      </w:r>
+      <w:proofErr w:type="gramEnd"/>
+      <w:r>
+        <w:rPr>
+          <w:b/>
+        </w:rPr>
+        <w:t xml:space="preserve"> </w:t>
       </w:r>
       <w:r>
         <w:t>shell command line in your lab notes (lab report)!</w:t>
@@ -332,6 +342,7 @@
         <w:t xml:space="preserve">Create a new group called </w:t>
       </w:r>
       <w:proofErr w:type="spellStart"/>
+      <w:proofErr w:type="gramStart"/>
       <w:r>
         <w:rPr>
           <w:rFonts w:ascii="Courier New" w:eastAsia="Courier New" w:hAnsi="Courier New" w:cs="Courier New"/>
@@ -354,7 +365,11 @@
         <w:t xml:space="preserve"> </w:t>
       </w:r>
       <w:r>
-        <w:t xml:space="preserve">! Note: replace </w:t>
+        <w:t>!</w:t>
+      </w:r>
+      <w:proofErr w:type="gramEnd"/>
+      <w:r>
+        <w:t xml:space="preserve"> Note: replace </w:t>
       </w:r>
       <w:r>
         <w:rPr>
@@ -406,7 +421,15 @@
         <w:t xml:space="preserve">/etc </w:t>
       </w:r>
       <w:r>
-        <w:t>received a new entry as a consequence to step (2)?</w:t>
+        <w:t xml:space="preserve">received a new entry </w:t>
+      </w:r>
+      <w:proofErr w:type="gramStart"/>
+      <w:r>
+        <w:t>as a consequence</w:t>
+      </w:r>
+      <w:proofErr w:type="gramEnd"/>
+      <w:r>
+        <w:t xml:space="preserve"> to step (2)?</w:t>
       </w:r>
     </w:p>
     <w:p>
@@ -703,8 +726,13 @@
         <w:spacing w:after="2"/>
         <w:ind w:right="12" w:hanging="255"/>
       </w:pPr>
-      <w:r>
-        <w:t xml:space="preserve">User name: </w:t>
+      <w:proofErr w:type="gramStart"/>
+      <w:r>
+        <w:t>User name</w:t>
+      </w:r>
+      <w:proofErr w:type="gramEnd"/>
+      <w:r>
+        <w:t xml:space="preserve">: </w:t>
       </w:r>
       <w:r>
         <w:rPr>
@@ -898,14 +926,10 @@
     <w:p>
       <w:pPr>
         <w:ind w:left="983" w:right="12"/>
-        <w:rPr>
-          <w:lang w:val="en-AT"/>
-        </w:rPr>
       </w:pPr>
       <w:r>
         <w:rPr>
           <w:highlight w:val="yellow"/>
-          <w:lang w:val="en-AT"/>
         </w:rPr>
         <w:t>/etc/passwd, /etc/shadow</w:t>
       </w:r>
@@ -1091,7 +1115,15 @@
         <w:ind w:right="12" w:hanging="498"/>
       </w:pPr>
       <w:r>
-        <w:t xml:space="preserve">Try to login with user name </w:t>
+        <w:t xml:space="preserve">Try to login with </w:t>
+      </w:r>
+      <w:proofErr w:type="gramStart"/>
+      <w:r>
+        <w:t>user name</w:t>
+      </w:r>
+      <w:proofErr w:type="gramEnd"/>
+      <w:r>
+        <w:t xml:space="preserve"> </w:t>
       </w:r>
       <w:r>
         <w:rPr>
@@ -1106,8 +1138,16 @@
         <w:rPr>
           <w:i/>
         </w:rPr>
-        <w:t>(If not, what error message do you receive? See (7) )</w:t>
-      </w:r>
+        <w:t>(If not, what error message do you receive? See (7</w:t>
+      </w:r>
+      <w:proofErr w:type="gramStart"/>
+      <w:r>
+        <w:rPr>
+          <w:i/>
+        </w:rPr>
+        <w:t>) )</w:t>
+      </w:r>
+      <w:proofErr w:type="gramEnd"/>
     </w:p>
     <w:p>
       <w:pPr>
@@ -1293,6 +1333,9 @@
         <w:ind w:left="958" w:right="12" w:firstLine="0"/>
       </w:pPr>
       <w:r>
+        <w:rPr>
+          <w:noProof/>
+        </w:rPr>
         <w:drawing>
           <wp:inline distT="0" distB="0" distL="0" distR="0" wp14:anchorId="03486119" wp14:editId="3AD25FB0">
             <wp:extent cx="6161405" cy="1439545"/>
@@ -1339,19 +1382,7 @@
         <w:rPr>
           <w:highlight w:val="yellow"/>
         </w:rPr>
-        <w:t>Authentication works</w:t>
-      </w:r>
-      <w:r>
-        <w:rPr>
-          <w:highlight w:val="yellow"/>
-        </w:rPr>
-        <w:t xml:space="preserve">, but the SSH session is closed due to an error at </w:t>
-      </w:r>
-      <w:r>
-        <w:rPr>
-          <w:highlight w:val="yellow"/>
-        </w:rPr>
-        <w:t>/var/log/ssh-sessions/</w:t>
+        <w:t>Authentication works, but the SSH session is closed due to an error at /var/log/ssh-sessions/</w:t>
       </w:r>
     </w:p>
     <w:p>
@@ -1402,6 +1433,9 @@
         <w:ind w:left="983" w:right="12"/>
       </w:pPr>
       <w:r>
+        <w:rPr>
+          <w:noProof/>
+        </w:rPr>
         <w:drawing>
           <wp:inline distT="0" distB="0" distL="0" distR="0" wp14:anchorId="4C1A433D" wp14:editId="4AC55EB1">
             <wp:extent cx="6161405" cy="1829435"/>
@@ -1553,8 +1587,13 @@
         <w:spacing w:after="161"/>
         <w:ind w:right="12" w:hanging="255"/>
       </w:pPr>
-      <w:r>
-        <w:t>So what was the cause of the problem?</w:t>
+      <w:proofErr w:type="gramStart"/>
+      <w:r>
+        <w:t>So</w:t>
+      </w:r>
+      <w:proofErr w:type="gramEnd"/>
+      <w:r>
+        <w:t xml:space="preserve"> what was the cause of the problem?</w:t>
       </w:r>
     </w:p>
     <w:p>
@@ -1894,6 +1933,7 @@
         <w:t xml:space="preserve">(which reads from standard input, which in turn can be redirected from a pipe) instead, e.g.: </w:t>
       </w:r>
       <w:proofErr w:type="spellStart"/>
+      <w:proofErr w:type="gramStart"/>
       <w:r>
         <w:rPr>
           <w:rFonts w:ascii="Courier New" w:eastAsia="Courier New" w:hAnsi="Courier New" w:cs="Courier New"/>
@@ -1918,6 +1958,7 @@
         <w:t>password</w:t>
       </w:r>
       <w:proofErr w:type="spellEnd"/>
+      <w:proofErr w:type="gramEnd"/>
       <w:r>
         <w:rPr>
           <w:rFonts w:ascii="Courier New" w:eastAsia="Courier New" w:hAnsi="Courier New" w:cs="Courier New"/>
@@ -2279,11 +2320,19 @@
               <w:spacing w:after="0" w:line="259" w:lineRule="auto"/>
               <w:ind w:left="0" w:right="-94" w:firstLine="0"/>
             </w:pPr>
+            <w:proofErr w:type="gramStart"/>
             <w:r>
               <w:rPr>
                 <w:rFonts w:ascii="Courier New" w:eastAsia="Courier New" w:hAnsi="Courier New" w:cs="Courier New"/>
               </w:rPr>
-              <w:t>linux!is!c00l!</w:t>
+              <w:t>linux!is</w:t>
+            </w:r>
+            <w:proofErr w:type="gramEnd"/>
+            <w:r>
+              <w:rPr>
+                <w:rFonts w:ascii="Courier New" w:eastAsia="Courier New" w:hAnsi="Courier New" w:cs="Courier New"/>
+              </w:rPr>
+              <w:t>!c00l!</w:t>
             </w:r>
           </w:p>
         </w:tc>
@@ -3093,6 +3142,17 @@
     </w:p>
     <w:p>
       <w:pPr>
+        <w:ind w:left="958" w:right="12" w:firstLine="0"/>
+      </w:pPr>
+      <w:r>
+        <w:rPr>
+          <w:highlight w:val="yellow"/>
+        </w:rPr>
+        <w:t>Very insecure</w:t>
+      </w:r>
+    </w:p>
+    <w:p>
+      <w:pPr>
         <w:numPr>
           <w:ilvl w:val="1"/>
           <w:numId w:val="6"/>
@@ -3115,6 +3175,7 @@
         <w:t xml:space="preserve">Write and test a second script file </w:t>
       </w:r>
       <w:proofErr w:type="spellStart"/>
+      <w:proofErr w:type="gramStart"/>
       <w:r>
         <w:rPr>
           <w:rFonts w:ascii="Courier New" w:eastAsia="Courier New" w:hAnsi="Courier New" w:cs="Courier New"/>
@@ -3125,6 +3186,7 @@
         <w:t>that</w:t>
       </w:r>
       <w:proofErr w:type="spellEnd"/>
+      <w:proofErr w:type="gramEnd"/>
       <w:r>
         <w:t xml:space="preserve"> </w:t>
       </w:r>
@@ -3136,6 +3198,415 @@
       </w:r>
       <w:r>
         <w:t>all the users, groups and directories again! Insert your script as text here:</w:t>
+      </w:r>
+    </w:p>
+    <w:p>
+      <w:pPr>
+        <w:ind w:left="958" w:right="12" w:firstLine="0"/>
+      </w:pPr>
+      <w:proofErr w:type="gramStart"/>
+      <w:r>
+        <w:t>#!/</w:t>
+      </w:r>
+      <w:proofErr w:type="gramEnd"/>
+      <w:r>
+        <w:t>bin/bash</w:t>
+      </w:r>
+    </w:p>
+    <w:p>
+      <w:pPr>
+        <w:ind w:left="958" w:right="12" w:firstLine="0"/>
+      </w:pPr>
+    </w:p>
+    <w:p>
+      <w:pPr>
+        <w:ind w:left="958" w:right="12" w:firstLine="0"/>
+        <w:rPr>
+          <w:highlight w:val="yellow"/>
+        </w:rPr>
+      </w:pPr>
+      <w:r>
+        <w:rPr>
+          <w:highlight w:val="yellow"/>
+        </w:rPr>
+        <w:t># Delete users and their home directories</w:t>
+      </w:r>
+    </w:p>
+    <w:p>
+      <w:pPr>
+        <w:ind w:left="958" w:right="12" w:firstLine="0"/>
+        <w:rPr>
+          <w:highlight w:val="yellow"/>
+        </w:rPr>
+      </w:pPr>
+      <w:proofErr w:type="spellStart"/>
+      <w:r>
+        <w:rPr>
+          <w:highlight w:val="yellow"/>
+        </w:rPr>
+        <w:t>userdel</w:t>
+      </w:r>
+      <w:proofErr w:type="spellEnd"/>
+      <w:r>
+        <w:rPr>
+          <w:highlight w:val="yellow"/>
+        </w:rPr>
+        <w:t xml:space="preserve"> -r </w:t>
+      </w:r>
+      <w:proofErr w:type="spellStart"/>
+      <w:r>
+        <w:rPr>
+          <w:highlight w:val="yellow"/>
+        </w:rPr>
+        <w:t>adminNN</w:t>
+      </w:r>
+      <w:proofErr w:type="spellEnd"/>
+    </w:p>
+    <w:p>
+      <w:pPr>
+        <w:ind w:left="958" w:right="12" w:firstLine="0"/>
+        <w:rPr>
+          <w:highlight w:val="yellow"/>
+        </w:rPr>
+      </w:pPr>
+      <w:proofErr w:type="spellStart"/>
+      <w:r>
+        <w:rPr>
+          <w:highlight w:val="yellow"/>
+        </w:rPr>
+        <w:t>userdel</w:t>
+      </w:r>
+      <w:proofErr w:type="spellEnd"/>
+      <w:r>
+        <w:rPr>
+          <w:highlight w:val="yellow"/>
+        </w:rPr>
+        <w:t xml:space="preserve"> -r batman</w:t>
+      </w:r>
+    </w:p>
+    <w:p>
+      <w:pPr>
+        <w:ind w:left="958" w:right="12" w:firstLine="0"/>
+        <w:rPr>
+          <w:highlight w:val="yellow"/>
+        </w:rPr>
+      </w:pPr>
+      <w:proofErr w:type="spellStart"/>
+      <w:r>
+        <w:rPr>
+          <w:highlight w:val="yellow"/>
+        </w:rPr>
+        <w:t>userdel</w:t>
+      </w:r>
+      <w:proofErr w:type="spellEnd"/>
+      <w:r>
+        <w:rPr>
+          <w:highlight w:val="yellow"/>
+        </w:rPr>
+        <w:t xml:space="preserve"> -r robin</w:t>
+      </w:r>
+    </w:p>
+    <w:p>
+      <w:pPr>
+        <w:ind w:left="958" w:right="12" w:firstLine="0"/>
+        <w:rPr>
+          <w:highlight w:val="yellow"/>
+        </w:rPr>
+      </w:pPr>
+      <w:proofErr w:type="spellStart"/>
+      <w:r>
+        <w:rPr>
+          <w:highlight w:val="yellow"/>
+        </w:rPr>
+        <w:t>userdel</w:t>
+      </w:r>
+      <w:proofErr w:type="spellEnd"/>
+      <w:r>
+        <w:rPr>
+          <w:highlight w:val="yellow"/>
+        </w:rPr>
+        <w:t xml:space="preserve"> -r </w:t>
+      </w:r>
+      <w:proofErr w:type="spellStart"/>
+      <w:r>
+        <w:rPr>
+          <w:highlight w:val="yellow"/>
+        </w:rPr>
+        <w:t>catwoman</w:t>
+      </w:r>
+      <w:proofErr w:type="spellEnd"/>
+    </w:p>
+    <w:p>
+      <w:pPr>
+        <w:ind w:left="958" w:right="12" w:firstLine="0"/>
+        <w:rPr>
+          <w:highlight w:val="yellow"/>
+        </w:rPr>
+      </w:pPr>
+      <w:proofErr w:type="spellStart"/>
+      <w:r>
+        <w:rPr>
+          <w:highlight w:val="yellow"/>
+        </w:rPr>
+        <w:t>userdel</w:t>
+      </w:r>
+      <w:proofErr w:type="spellEnd"/>
+      <w:r>
+        <w:rPr>
+          <w:highlight w:val="yellow"/>
+        </w:rPr>
+        <w:t xml:space="preserve"> -r </w:t>
+      </w:r>
+      <w:proofErr w:type="spellStart"/>
+      <w:r>
+        <w:rPr>
+          <w:highlight w:val="yellow"/>
+        </w:rPr>
+        <w:t>gordon</w:t>
+      </w:r>
+      <w:proofErr w:type="spellEnd"/>
+    </w:p>
+    <w:p>
+      <w:pPr>
+        <w:ind w:left="958" w:right="12" w:firstLine="0"/>
+        <w:rPr>
+          <w:highlight w:val="yellow"/>
+        </w:rPr>
+      </w:pPr>
+      <w:proofErr w:type="spellStart"/>
+      <w:r>
+        <w:rPr>
+          <w:highlight w:val="yellow"/>
+        </w:rPr>
+        <w:t>userdel</w:t>
+      </w:r>
+      <w:proofErr w:type="spellEnd"/>
+      <w:r>
+        <w:rPr>
+          <w:highlight w:val="yellow"/>
+        </w:rPr>
+        <w:t xml:space="preserve"> -r joker</w:t>
+      </w:r>
+    </w:p>
+    <w:p>
+      <w:pPr>
+        <w:ind w:left="958" w:right="12" w:firstLine="0"/>
+        <w:rPr>
+          <w:highlight w:val="yellow"/>
+        </w:rPr>
+      </w:pPr>
+      <w:proofErr w:type="spellStart"/>
+      <w:r>
+        <w:rPr>
+          <w:highlight w:val="yellow"/>
+        </w:rPr>
+        <w:t>userdel</w:t>
+      </w:r>
+      <w:proofErr w:type="spellEnd"/>
+      <w:r>
+        <w:rPr>
+          <w:highlight w:val="yellow"/>
+        </w:rPr>
+        <w:t xml:space="preserve"> -r penguin</w:t>
+      </w:r>
+    </w:p>
+    <w:p>
+      <w:pPr>
+        <w:ind w:left="958" w:right="12" w:firstLine="0"/>
+        <w:rPr>
+          <w:highlight w:val="yellow"/>
+        </w:rPr>
+      </w:pPr>
+    </w:p>
+    <w:p>
+      <w:pPr>
+        <w:ind w:left="958" w:right="12" w:firstLine="0"/>
+        <w:rPr>
+          <w:highlight w:val="yellow"/>
+        </w:rPr>
+      </w:pPr>
+      <w:r>
+        <w:rPr>
+          <w:highlight w:val="yellow"/>
+        </w:rPr>
+        <w:t># Delete groups</w:t>
+      </w:r>
+    </w:p>
+    <w:p>
+      <w:pPr>
+        <w:ind w:left="958" w:right="12" w:firstLine="0"/>
+        <w:rPr>
+          <w:highlight w:val="yellow"/>
+        </w:rPr>
+      </w:pPr>
+      <w:proofErr w:type="spellStart"/>
+      <w:r>
+        <w:rPr>
+          <w:highlight w:val="yellow"/>
+        </w:rPr>
+        <w:t>groupdel</w:t>
+      </w:r>
+      <w:proofErr w:type="spellEnd"/>
+      <w:r>
+        <w:rPr>
+          <w:highlight w:val="yellow"/>
+        </w:rPr>
+        <w:t xml:space="preserve"> </w:t>
+      </w:r>
+      <w:proofErr w:type="spellStart"/>
+      <w:r>
+        <w:rPr>
+          <w:highlight w:val="yellow"/>
+        </w:rPr>
+        <w:t>heroesNN</w:t>
+      </w:r>
+      <w:proofErr w:type="spellEnd"/>
+    </w:p>
+    <w:p>
+      <w:pPr>
+        <w:ind w:left="958" w:right="12" w:firstLine="0"/>
+        <w:rPr>
+          <w:highlight w:val="yellow"/>
+        </w:rPr>
+      </w:pPr>
+      <w:proofErr w:type="spellStart"/>
+      <w:r>
+        <w:rPr>
+          <w:highlight w:val="yellow"/>
+        </w:rPr>
+        <w:t>groupdel</w:t>
+      </w:r>
+      <w:proofErr w:type="spellEnd"/>
+      <w:r>
+        <w:rPr>
+          <w:highlight w:val="yellow"/>
+        </w:rPr>
+        <w:t xml:space="preserve"> friends</w:t>
+      </w:r>
+    </w:p>
+    <w:p>
+      <w:pPr>
+        <w:ind w:left="958" w:right="12" w:firstLine="0"/>
+        <w:rPr>
+          <w:highlight w:val="yellow"/>
+        </w:rPr>
+      </w:pPr>
+      <w:proofErr w:type="spellStart"/>
+      <w:r>
+        <w:rPr>
+          <w:highlight w:val="yellow"/>
+        </w:rPr>
+        <w:t>groupdel</w:t>
+      </w:r>
+      <w:proofErr w:type="spellEnd"/>
+      <w:r>
+        <w:rPr>
+          <w:highlight w:val="yellow"/>
+        </w:rPr>
+        <w:t xml:space="preserve"> police</w:t>
+      </w:r>
+    </w:p>
+    <w:p>
+      <w:pPr>
+        <w:ind w:left="958" w:right="12" w:firstLine="0"/>
+        <w:rPr>
+          <w:highlight w:val="yellow"/>
+        </w:rPr>
+      </w:pPr>
+      <w:proofErr w:type="spellStart"/>
+      <w:r>
+        <w:rPr>
+          <w:highlight w:val="yellow"/>
+        </w:rPr>
+        <w:t>groupdel</w:t>
+      </w:r>
+      <w:proofErr w:type="spellEnd"/>
+      <w:r>
+        <w:rPr>
+          <w:highlight w:val="yellow"/>
+        </w:rPr>
+        <w:t xml:space="preserve"> villains</w:t>
+      </w:r>
+    </w:p>
+    <w:p>
+      <w:pPr>
+        <w:ind w:left="958" w:right="12" w:firstLine="0"/>
+        <w:rPr>
+          <w:highlight w:val="yellow"/>
+        </w:rPr>
+      </w:pPr>
+    </w:p>
+    <w:p>
+      <w:pPr>
+        <w:ind w:left="958" w:right="12" w:firstLine="0"/>
+        <w:rPr>
+          <w:highlight w:val="yellow"/>
+        </w:rPr>
+      </w:pPr>
+      <w:r>
+        <w:rPr>
+          <w:highlight w:val="yellow"/>
+        </w:rPr>
+        <w:t># Delete remaining directories</w:t>
+      </w:r>
+    </w:p>
+    <w:p>
+      <w:pPr>
+        <w:ind w:left="958" w:right="12" w:firstLine="0"/>
+        <w:rPr>
+          <w:highlight w:val="yellow"/>
+        </w:rPr>
+      </w:pPr>
+      <w:r>
+        <w:rPr>
+          <w:highlight w:val="yellow"/>
+        </w:rPr>
+        <w:t>rm -rf /home/heroes</w:t>
+      </w:r>
+      <w:r>
+        <w:rPr>
+          <w:highlight w:val="yellow"/>
+        </w:rPr>
+        <w:t>28</w:t>
+      </w:r>
+    </w:p>
+    <w:p>
+      <w:pPr>
+        <w:ind w:left="958" w:right="12" w:firstLine="0"/>
+        <w:rPr>
+          <w:highlight w:val="yellow"/>
+        </w:rPr>
+      </w:pPr>
+      <w:r>
+        <w:rPr>
+          <w:highlight w:val="yellow"/>
+        </w:rPr>
+        <w:t>rm -rf /home/friends</w:t>
+      </w:r>
+    </w:p>
+    <w:p>
+      <w:pPr>
+        <w:ind w:left="958" w:right="12" w:firstLine="0"/>
+        <w:rPr>
+          <w:highlight w:val="yellow"/>
+        </w:rPr>
+      </w:pPr>
+      <w:r>
+        <w:rPr>
+          <w:highlight w:val="yellow"/>
+        </w:rPr>
+        <w:t>rm -rf /home/police</w:t>
+      </w:r>
+    </w:p>
+    <w:p>
+      <w:pPr>
+        <w:ind w:left="958" w:right="12" w:firstLine="0"/>
+      </w:pPr>
+      <w:r>
+        <w:rPr>
+          <w:highlight w:val="yellow"/>
+        </w:rPr>
+        <w:t>rm -rf /home/villains</w:t>
       </w:r>
     </w:p>
     <w:p>
@@ -3172,6 +3643,9 @@
     </w:p>
     <w:p>
       <w:r>
+        <w:rPr>
+          <w:noProof/>
+        </w:rPr>
         <w:lastRenderedPageBreak/>
         <w:drawing>
           <wp:inline distT="0" distB="0" distL="0" distR="0" wp14:anchorId="57C77C37" wp14:editId="1AF53069">
@@ -3409,11 +3883,19 @@
         </mc:Fallback>
       </mc:AlternateContent>
     </w:r>
+    <w:proofErr w:type="gramStart"/>
     <w:r>
       <w:rPr>
         <w:sz w:val="18"/>
       </w:rPr>
-      <w:t xml:space="preserve">Version </w:t>
+      <w:t>Version</w:t>
+    </w:r>
+    <w:proofErr w:type="gramEnd"/>
+    <w:r>
+      <w:rPr>
+        <w:sz w:val="18"/>
+      </w:rPr>
+      <w:t xml:space="preserve"> </w:t>
     </w:r>
     <w:proofErr w:type="spellStart"/>
     <w:r>
@@ -3584,11 +4066,19 @@
         </mc:Fallback>
       </mc:AlternateContent>
     </w:r>
+    <w:proofErr w:type="gramStart"/>
     <w:r>
       <w:rPr>
         <w:sz w:val="18"/>
       </w:rPr>
-      <w:t xml:space="preserve">Version </w:t>
+      <w:t>Version</w:t>
+    </w:r>
+    <w:proofErr w:type="gramEnd"/>
+    <w:r>
+      <w:rPr>
+        <w:sz w:val="18"/>
+      </w:rPr>
+      <w:t xml:space="preserve"> </w:t>
     </w:r>
     <w:proofErr w:type="spellStart"/>
     <w:r>
@@ -3753,11 +4243,19 @@
         </mc:Fallback>
       </mc:AlternateContent>
     </w:r>
+    <w:proofErr w:type="gramStart"/>
     <w:r>
       <w:rPr>
         <w:sz w:val="18"/>
       </w:rPr>
-      <w:t xml:space="preserve">Version </w:t>
+      <w:t>Version</w:t>
+    </w:r>
+    <w:proofErr w:type="gramEnd"/>
+    <w:r>
+      <w:rPr>
+        <w:sz w:val="18"/>
+      </w:rPr>
+      <w:t xml:space="preserve"> </w:t>
     </w:r>
     <w:proofErr w:type="spellStart"/>
     <w:r>

</xml_diff>